<commit_message>
User doc font upd
</commit_message>
<xml_diff>
--- a/Felhasználói dokumentáció.docx
+++ b/Felhasználói dokumentáció.docx
@@ -1329,12 +1329,14 @@
         <w:pStyle w:val="NormlWeb"/>
         <w:jc w:val="both"/>
         <w:rPr>
+          <w:rFonts w:asciiTheme="minorHAnsi" w:hAnsiTheme="minorHAnsi" w:cstheme="minorHAnsi"/>
           <w:sz w:val="28"/>
           <w:szCs w:val="28"/>
         </w:rPr>
       </w:pPr>
       <w:r>
         <w:rPr>
+          <w:rFonts w:asciiTheme="minorHAnsi" w:hAnsiTheme="minorHAnsi" w:cstheme="minorHAnsi"/>
           <w:sz w:val="28"/>
           <w:szCs w:val="28"/>
         </w:rPr>
@@ -1342,6 +1344,7 @@
       </w:r>
       <w:r>
         <w:rPr>
+          <w:rFonts w:asciiTheme="minorHAnsi" w:hAnsiTheme="minorHAnsi" w:cstheme="minorHAnsi"/>
           <w:sz w:val="28"/>
           <w:szCs w:val="28"/>
         </w:rPr>
@@ -1349,6 +1352,7 @@
       </w:r>
       <w:r>
         <w:rPr>
+          <w:rFonts w:asciiTheme="minorHAnsi" w:hAnsiTheme="minorHAnsi" w:cstheme="minorHAnsi"/>
           <w:sz w:val="28"/>
           <w:szCs w:val="28"/>
         </w:rPr>
@@ -1360,12 +1364,14 @@
         <w:pStyle w:val="NormlWeb"/>
         <w:jc w:val="both"/>
         <w:rPr>
+          <w:rFonts w:asciiTheme="minorHAnsi" w:hAnsiTheme="minorHAnsi" w:cstheme="minorHAnsi"/>
           <w:sz w:val="28"/>
           <w:szCs w:val="28"/>
         </w:rPr>
       </w:pPr>
       <w:r>
         <w:rPr>
+          <w:rFonts w:asciiTheme="minorHAnsi" w:hAnsiTheme="minorHAnsi" w:cstheme="minorHAnsi"/>
           <w:noProof/>
           <w:sz w:val="28"/>
           <w:szCs w:val="28"/>
@@ -1436,6 +1442,7 @@
       </w:r>
       <w:r>
         <w:rPr>
+          <w:rFonts w:asciiTheme="minorHAnsi" w:hAnsiTheme="minorHAnsi" w:cstheme="minorHAnsi"/>
           <w:sz w:val="28"/>
           <w:szCs w:val="28"/>
         </w:rPr>
@@ -1443,6 +1450,7 @@
       </w:r>
       <w:r>
         <w:rPr>
+          <w:rFonts w:asciiTheme="minorHAnsi" w:hAnsiTheme="minorHAnsi" w:cstheme="minorHAnsi"/>
           <w:sz w:val="28"/>
           <w:szCs w:val="28"/>
         </w:rPr>
@@ -1450,6 +1458,7 @@
       </w:r>
       <w:r>
         <w:rPr>
+          <w:rFonts w:asciiTheme="minorHAnsi" w:hAnsiTheme="minorHAnsi" w:cstheme="minorHAnsi"/>
           <w:sz w:val="28"/>
           <w:szCs w:val="28"/>
         </w:rPr>
@@ -1457,6 +1466,7 @@
       </w:r>
       <w:r>
         <w:rPr>
+          <w:rFonts w:asciiTheme="minorHAnsi" w:hAnsiTheme="minorHAnsi" w:cstheme="minorHAnsi"/>
           <w:sz w:val="28"/>
           <w:szCs w:val="28"/>
         </w:rPr>
@@ -1467,15 +1477,22 @@
       <w:pPr>
         <w:pStyle w:val="NormlWeb"/>
         <w:jc w:val="both"/>
+        <w:rPr>
+          <w:rFonts w:asciiTheme="minorHAnsi" w:hAnsiTheme="minorHAnsi" w:cstheme="minorHAnsi"/>
+        </w:rPr>
       </w:pPr>
     </w:p>
     <w:p>
       <w:pPr>
         <w:pStyle w:val="NormlWeb"/>
         <w:jc w:val="both"/>
+        <w:rPr>
+          <w:rFonts w:asciiTheme="minorHAnsi" w:hAnsiTheme="minorHAnsi" w:cstheme="minorHAnsi"/>
+        </w:rPr>
       </w:pPr>
       <w:r>
         <w:rPr>
+          <w:rFonts w:asciiTheme="minorHAnsi" w:hAnsiTheme="minorHAnsi" w:cstheme="minorHAnsi"/>
           <w:noProof/>
           <w:sz w:val="28"/>
           <w:szCs w:val="28"/>
@@ -1554,6 +1571,7 @@
       </w:r>
       <w:r>
         <w:rPr>
+          <w:rFonts w:asciiTheme="minorHAnsi" w:hAnsiTheme="minorHAnsi" w:cstheme="minorHAnsi"/>
           <w:noProof/>
           <w:sz w:val="28"/>
           <w:szCs w:val="28"/>
@@ -1632,16 +1650,21 @@
       </w:r>
       <w:r>
         <w:rPr>
+          <w:rFonts w:asciiTheme="minorHAnsi" w:hAnsiTheme="minorHAnsi" w:cstheme="minorHAnsi"/>
           <w:sz w:val="28"/>
           <w:szCs w:val="28"/>
         </w:rPr>
         <w:t>Bejelentkezés után megjelenik a profil gomb.</w:t>
       </w:r>
       <w:r>
+        <w:rPr>
+          <w:rFonts w:asciiTheme="minorHAnsi" w:hAnsiTheme="minorHAnsi" w:cstheme="minorHAnsi"/>
+        </w:rPr>
         <w:t xml:space="preserve"> </w:t>
       </w:r>
       <w:r>
         <w:rPr>
+          <w:rFonts w:asciiTheme="minorHAnsi" w:hAnsiTheme="minorHAnsi" w:cstheme="minorHAnsi"/>
           <w:noProof/>
         </w:rPr>
         <w:drawing>
@@ -1698,12 +1721,14 @@
       <w:pPr>
         <w:pStyle w:val="NormlWeb"/>
         <w:rPr>
+          <w:rFonts w:asciiTheme="minorHAnsi" w:hAnsiTheme="minorHAnsi" w:cstheme="minorHAnsi"/>
           <w:sz w:val="28"/>
           <w:szCs w:val="28"/>
         </w:rPr>
       </w:pPr>
       <w:r>
         <w:rPr>
+          <w:rFonts w:asciiTheme="minorHAnsi" w:hAnsiTheme="minorHAnsi" w:cstheme="minorHAnsi"/>
           <w:sz w:val="28"/>
           <w:szCs w:val="28"/>
         </w:rPr>
@@ -1711,6 +1736,7 @@
       </w:r>
       <w:r>
         <w:rPr>
+          <w:rFonts w:asciiTheme="minorHAnsi" w:hAnsiTheme="minorHAnsi" w:cstheme="minorHAnsi"/>
           <w:sz w:val="28"/>
           <w:szCs w:val="28"/>
         </w:rPr>
@@ -1718,31 +1744,46 @@
       </w:r>
       <w:r>
         <w:rPr>
+          <w:rFonts w:asciiTheme="minorHAnsi" w:hAnsiTheme="minorHAnsi" w:cstheme="minorHAnsi"/>
           <w:sz w:val="28"/>
           <w:szCs w:val="28"/>
         </w:rPr>
         <w:t xml:space="preserve"> ami a profilhoz van kötve.</w:t>
       </w:r>
+      <w:bookmarkStart w:id="0" w:name="_GoBack"/>
+      <w:bookmarkEnd w:id="0"/>
     </w:p>
     <w:p>
       <w:pPr>
         <w:pStyle w:val="NormlWeb"/>
+        <w:rPr>
+          <w:rFonts w:asciiTheme="minorHAnsi" w:hAnsiTheme="minorHAnsi" w:cstheme="minorHAnsi"/>
+        </w:rPr>
       </w:pPr>
     </w:p>
     <w:p>
       <w:pPr>
         <w:pStyle w:val="NormlWeb"/>
+        <w:rPr>
+          <w:rFonts w:asciiTheme="minorHAnsi" w:hAnsiTheme="minorHAnsi" w:cstheme="minorHAnsi"/>
+        </w:rPr>
       </w:pPr>
     </w:p>
     <w:p>
       <w:pPr>
         <w:pStyle w:val="NormlWeb"/>
+        <w:rPr>
+          <w:rFonts w:asciiTheme="minorHAnsi" w:hAnsiTheme="minorHAnsi" w:cstheme="minorHAnsi"/>
+        </w:rPr>
       </w:pPr>
     </w:p>
     <w:p>
       <w:pPr>
         <w:pStyle w:val="NormlWeb"/>
         <w:jc w:val="both"/>
+        <w:rPr>
+          <w:rFonts w:asciiTheme="minorHAnsi" w:hAnsiTheme="minorHAnsi" w:cstheme="minorHAnsi"/>
+        </w:rPr>
       </w:pPr>
     </w:p>
     <w:p>
@@ -1750,12 +1791,14 @@
         <w:pStyle w:val="NormlWeb"/>
         <w:jc w:val="both"/>
         <w:rPr>
+          <w:rFonts w:asciiTheme="minorHAnsi" w:hAnsiTheme="minorHAnsi" w:cstheme="minorHAnsi"/>
           <w:sz w:val="28"/>
           <w:szCs w:val="28"/>
         </w:rPr>
       </w:pPr>
       <w:r>
         <w:rPr>
+          <w:rFonts w:asciiTheme="minorHAnsi" w:hAnsiTheme="minorHAnsi" w:cstheme="minorHAnsi"/>
           <w:sz w:val="28"/>
           <w:szCs w:val="28"/>
         </w:rPr>
@@ -1767,12 +1810,14 @@
         <w:pStyle w:val="NormlWeb"/>
         <w:jc w:val="both"/>
         <w:rPr>
+          <w:rFonts w:asciiTheme="minorHAnsi" w:hAnsiTheme="minorHAnsi" w:cstheme="minorHAnsi"/>
           <w:sz w:val="28"/>
           <w:szCs w:val="28"/>
         </w:rPr>
       </w:pPr>
       <w:r>
         <w:rPr>
+          <w:rFonts w:asciiTheme="minorHAnsi" w:hAnsiTheme="minorHAnsi" w:cstheme="minorHAnsi"/>
           <w:sz w:val="28"/>
           <w:szCs w:val="28"/>
         </w:rPr>
@@ -1780,6 +1825,7 @@
       </w:r>
       <w:r>
         <w:rPr>
+          <w:rFonts w:asciiTheme="minorHAnsi" w:hAnsiTheme="minorHAnsi" w:cstheme="minorHAnsi"/>
           <w:noProof/>
           <w:sz w:val="28"/>
           <w:szCs w:val="28"/>
@@ -1788,6 +1834,7 @@
       </w:r>
       <w:r>
         <w:rPr>
+          <w:rFonts w:asciiTheme="minorHAnsi" w:hAnsiTheme="minorHAnsi" w:cstheme="minorHAnsi"/>
           <w:noProof/>
           <w:sz w:val="28"/>
           <w:szCs w:val="28"/>
@@ -1847,6 +1894,7 @@
         <w:pStyle w:val="NormlWeb"/>
         <w:jc w:val="both"/>
         <w:rPr>
+          <w:rFonts w:asciiTheme="minorHAnsi" w:hAnsiTheme="minorHAnsi" w:cstheme="minorHAnsi"/>
           <w:sz w:val="28"/>
           <w:szCs w:val="28"/>
         </w:rPr>
@@ -1857,12 +1905,14 @@
         <w:pStyle w:val="NormlWeb"/>
         <w:jc w:val="both"/>
         <w:rPr>
+          <w:rFonts w:asciiTheme="minorHAnsi" w:hAnsiTheme="minorHAnsi" w:cstheme="minorHAnsi"/>
           <w:sz w:val="28"/>
           <w:szCs w:val="28"/>
         </w:rPr>
       </w:pPr>
       <w:r>
         <w:rPr>
+          <w:rFonts w:asciiTheme="minorHAnsi" w:hAnsiTheme="minorHAnsi" w:cstheme="minorHAnsi"/>
           <w:noProof/>
           <w:sz w:val="28"/>
           <w:szCs w:val="28"/>
@@ -1935,6 +1985,7 @@
       </w:r>
       <w:r>
         <w:rPr>
+          <w:rFonts w:asciiTheme="minorHAnsi" w:hAnsiTheme="minorHAnsi" w:cstheme="minorHAnsi"/>
           <w:sz w:val="28"/>
           <w:szCs w:val="28"/>
         </w:rPr>
@@ -1942,6 +1993,7 @@
       </w:r>
       <w:r>
         <w:rPr>
+          <w:rFonts w:asciiTheme="minorHAnsi" w:hAnsiTheme="minorHAnsi" w:cstheme="minorHAnsi"/>
           <w:sz w:val="28"/>
           <w:szCs w:val="28"/>
         </w:rPr>
@@ -1949,6 +2001,7 @@
       </w:r>
       <w:r>
         <w:rPr>
+          <w:rFonts w:asciiTheme="minorHAnsi" w:hAnsiTheme="minorHAnsi" w:cstheme="minorHAnsi"/>
           <w:sz w:val="28"/>
           <w:szCs w:val="28"/>
         </w:rPr>
@@ -1956,6 +2009,7 @@
       </w:r>
       <w:r>
         <w:rPr>
+          <w:rFonts w:asciiTheme="minorHAnsi" w:hAnsiTheme="minorHAnsi" w:cstheme="minorHAnsi"/>
           <w:sz w:val="28"/>
           <w:szCs w:val="28"/>
         </w:rPr>
@@ -1966,7 +2020,7 @@
       <w:pPr>
         <w:jc w:val="both"/>
         <w:rPr>
-          <w:rFonts w:ascii="Times New Roman" w:eastAsia="Times New Roman" w:hAnsi="Times New Roman" w:cs="Times New Roman"/>
+          <w:rFonts w:eastAsia="Times New Roman" w:cstheme="minorHAnsi"/>
           <w:sz w:val="24"/>
           <w:szCs w:val="24"/>
           <w:lang w:eastAsia="hu-HU"/>
@@ -1974,6 +2028,7 @@
       </w:pPr>
       <w:r>
         <w:rPr>
+          <w:rFonts w:cstheme="minorHAnsi"/>
           <w:noProof/>
         </w:rPr>
         <w:drawing>
@@ -2034,6 +2089,9 @@
         </w:drawing>
       </w:r>
       <w:r>
+        <w:rPr>
+          <w:rFonts w:cstheme="minorHAnsi"/>
+        </w:rPr>
         <w:br w:type="page"/>
       </w:r>
     </w:p>
@@ -2041,7 +2099,7 @@
       <w:pPr>
         <w:spacing w:before="100" w:beforeAutospacing="1" w:after="100" w:afterAutospacing="1" w:line="240" w:lineRule="auto"/>
         <w:rPr>
-          <w:rFonts w:ascii="Times New Roman" w:eastAsia="Times New Roman" w:hAnsi="Times New Roman" w:cs="Times New Roman"/>
+          <w:rFonts w:eastAsia="Times New Roman" w:cstheme="minorHAnsi"/>
           <w:sz w:val="24"/>
           <w:szCs w:val="24"/>
           <w:lang w:eastAsia="hu-HU"/>
@@ -2049,7 +2107,7 @@
       </w:pPr>
       <w:r>
         <w:rPr>
-          <w:rFonts w:ascii="Times New Roman" w:eastAsia="Times New Roman" w:hAnsi="Times New Roman" w:cs="Times New Roman"/>
+          <w:rFonts w:eastAsia="Times New Roman" w:cstheme="minorHAnsi"/>
           <w:noProof/>
           <w:sz w:val="24"/>
           <w:szCs w:val="24"/>
@@ -2130,7 +2188,7 @@
       </w:r>
       <w:r>
         <w:rPr>
-          <w:rFonts w:ascii="Times New Roman" w:eastAsia="Times New Roman" w:hAnsi="Times New Roman" w:cs="Times New Roman"/>
+          <w:rFonts w:eastAsia="Times New Roman" w:cstheme="minorHAnsi"/>
           <w:noProof/>
           <w:sz w:val="24"/>
           <w:szCs w:val="24"/>
@@ -2191,12 +2249,14 @@
         <w:pStyle w:val="NormlWeb"/>
         <w:jc w:val="both"/>
         <w:rPr>
+          <w:rFonts w:asciiTheme="minorHAnsi" w:hAnsiTheme="minorHAnsi" w:cstheme="minorHAnsi"/>
           <w:sz w:val="28"/>
           <w:szCs w:val="28"/>
         </w:rPr>
       </w:pPr>
       <w:r>
         <w:rPr>
+          <w:rFonts w:asciiTheme="minorHAnsi" w:hAnsiTheme="minorHAnsi" w:cstheme="minorHAnsi"/>
           <w:sz w:val="28"/>
           <w:szCs w:val="28"/>
         </w:rPr>
@@ -2208,12 +2268,14 @@
         <w:pStyle w:val="NormlWeb"/>
         <w:jc w:val="both"/>
         <w:rPr>
+          <w:rFonts w:asciiTheme="minorHAnsi" w:hAnsiTheme="minorHAnsi" w:cstheme="minorHAnsi"/>
           <w:sz w:val="28"/>
           <w:szCs w:val="28"/>
         </w:rPr>
       </w:pPr>
       <w:r>
         <w:rPr>
+          <w:rFonts w:asciiTheme="minorHAnsi" w:hAnsiTheme="minorHAnsi" w:cstheme="minorHAnsi"/>
           <w:sz w:val="28"/>
           <w:szCs w:val="28"/>
         </w:rPr>
@@ -2224,7 +2286,7 @@
       <w:pPr>
         <w:spacing w:before="100" w:beforeAutospacing="1" w:after="100" w:afterAutospacing="1" w:line="240" w:lineRule="auto"/>
         <w:rPr>
-          <w:rFonts w:ascii="Times New Roman" w:eastAsia="Times New Roman" w:hAnsi="Times New Roman" w:cs="Times New Roman"/>
+          <w:rFonts w:eastAsia="Times New Roman" w:cstheme="minorHAnsi"/>
           <w:sz w:val="24"/>
           <w:szCs w:val="24"/>
           <w:lang w:eastAsia="hu-HU"/>
@@ -2232,7 +2294,7 @@
       </w:pPr>
       <w:r>
         <w:rPr>
-          <w:rFonts w:ascii="Times New Roman" w:eastAsia="Times New Roman" w:hAnsi="Times New Roman" w:cs="Times New Roman"/>
+          <w:rFonts w:eastAsia="Times New Roman" w:cstheme="minorHAnsi"/>
           <w:noProof/>
           <w:sz w:val="24"/>
           <w:szCs w:val="24"/>
@@ -2294,6 +2356,7 @@
         <w:spacing w:before="0" w:beforeAutospacing="0"/>
         <w:jc w:val="both"/>
         <w:rPr>
+          <w:rFonts w:asciiTheme="minorHAnsi" w:hAnsiTheme="minorHAnsi" w:cstheme="minorHAnsi"/>
           <w:sz w:val="28"/>
           <w:szCs w:val="28"/>
         </w:rPr>
@@ -2305,12 +2368,14 @@
         <w:spacing w:before="0" w:beforeAutospacing="0"/>
         <w:jc w:val="both"/>
         <w:rPr>
+          <w:rFonts w:asciiTheme="minorHAnsi" w:hAnsiTheme="minorHAnsi" w:cstheme="minorHAnsi"/>
           <w:sz w:val="28"/>
           <w:szCs w:val="28"/>
         </w:rPr>
       </w:pPr>
       <w:r>
         <w:rPr>
+          <w:rFonts w:asciiTheme="minorHAnsi" w:hAnsiTheme="minorHAnsi" w:cstheme="minorHAnsi"/>
           <w:sz w:val="28"/>
           <w:szCs w:val="28"/>
         </w:rPr>
@@ -2321,7 +2386,7 @@
       <w:pPr>
         <w:jc w:val="both"/>
         <w:rPr>
-          <w:rFonts w:ascii="Times New Roman" w:eastAsia="Times New Roman" w:hAnsi="Times New Roman" w:cs="Times New Roman"/>
+          <w:rFonts w:eastAsia="Times New Roman" w:cstheme="minorHAnsi"/>
           <w:sz w:val="28"/>
           <w:szCs w:val="28"/>
           <w:lang w:eastAsia="hu-HU"/>
@@ -2329,6 +2394,7 @@
       </w:pPr>
       <w:r>
         <w:rPr>
+          <w:rFonts w:cstheme="minorHAnsi"/>
           <w:sz w:val="28"/>
           <w:szCs w:val="28"/>
         </w:rPr>
@@ -2344,8 +2410,6 @@
       <w:pPr>
         <w:pStyle w:val="NormlWeb"/>
       </w:pPr>
-      <w:bookmarkStart w:id="0" w:name="_GoBack"/>
-      <w:bookmarkEnd w:id="0"/>
     </w:p>
     <w:sectPr>
       <w:pgSz w:w="11906" w:h="16838"/>
@@ -3101,7 +3165,7 @@
 </file>
 
 <file path=customXml/itemProps1.xml><?xml version="1.0" encoding="utf-8"?>
-<ds:datastoreItem xmlns:ds="http://schemas.openxmlformats.org/officeDocument/2006/customXml" ds:itemID="{7AD2D2F4-E890-4D13-B449-D55CE133C8A0}">
+<ds:datastoreItem xmlns:ds="http://schemas.openxmlformats.org/officeDocument/2006/customXml" ds:itemID="{D8CE701D-19ED-4207-95DC-3B624DED9435}">
   <ds:schemaRefs>
     <ds:schemaRef ds:uri="http://schemas.openxmlformats.org/officeDocument/2006/bibliography"/>
   </ds:schemaRefs>

</xml_diff>